<commit_message>
Audit fix: align code/data/figures/docs across Python/MATLAB/paper
- Irradiance model: OU process (tau=1s, sigma=25%), aerosol x0.93, July peak 744 W/m2
- LSTM: deterministic seed 42, 4-unit gain scheduler (101 params), 4,385 total
- New metrics: R2=0.835, MAE=54.7, RMSE=72.6 (OU data more realistic, thus lower)
- TFLite: Flex ops fallback for ESP32-S3 (TensorListReserve compat)
- MATLAB ha_artemis_v3: float 13.8V, 3-stage charging; ha_battery_v3: 6A bulk limit
- Python controllers: 15% blend deadband, [0.20,0.55] alpha plateau
- MOSFET IRFZ44N->IRFB4110 across all docs, figs, presentations
- Study guides, highlights, cover letter: N=200->30, 7,900-8,500->~1,500 BDT
- All 9 figures regenerated at 300 DPI, manuscript PDF rebuilt
</commit_message>
<xml_diff>
--- a/Docs/Study_materials/helios_artemis_primer.docx
+++ b/Docs/Study_materials/helios_artemis_primer.docx
@@ -6332,7 +6332,7 @@
         <w:jc w:val="both"/>
       </w:pPr>
       <w:r>
-        <w:t>Total: ~7,430 parameters. This is tiny compared to modern AI models — GPT-4 has approximately 1.8 trillion parameters. But tiny is the point: this model must run on a microcontroller with limited memory.</w:t>
+        <w:t>Total: ~4,486 parameters. This is tiny compared to modern AI models — GPT-4 has approximately 1.8 trillion parameters. But tiny is the point: this model must run on a microcontroller with limited memory.</w:t>
       </w:r>
     </w:p>
     <w:p>
@@ -7374,7 +7374,7 @@
         <w:spacing w:after="80"/>
       </w:pPr>
       <w:r>
-        <w:t xml:space="preserve">IRFZ44N MOSFET (VDS = 60 V, RDS(on) = 28 </w:t>
+        <w:t xml:space="preserve">IRFB4110 MOSFET (VDS = 60 V, RDS(on) = 28 </w:t>
       </w:r>
       <w:proofErr w:type="spellStart"/>
       <w:r>

</xml_diff>